<commit_message>
Verify CNN results and improve project report
</commit_message>
<xml_diff>
--- a/CNN_Project_Report.docx
+++ b/CNN_Project_Report.docx
@@ -8,6 +8,11 @@
       </w:pPr>
       <w:r>
         <w:t>Image Classification with Convolutional Neural Networks</w:t>
+      </w:r>
+    </w:p>
+    <w:p>
+      <w:r>
+        <w:t>Albert Kabore, PhD student in AI</w:t>
       </w:r>
     </w:p>
     <w:p>
@@ -25,7 +30,7 @@
     </w:p>
     <w:p>
       <w:r>
-        <w:t>This project classifies photographs into eight object categories using a convolutional neural network (CNN). The Natural Images dataset contains 6899 labeled images of airplanes, cars, cats, dogs, flowers, fruit, motorbikes, and people. The objective is to compare a simple CNN with a version using batch normalization and dropout, then evaluate the selected model on unseen images.</w:t>
+        <w:t>This project studies eight-class image classification with PyTorch CNNs. The Natural Images dataset contains 6,899 labeled photographs of airplanes, cars, cats, dogs, flowers, fruit, motorbikes, and people. The question is whether adding batch normalization and dropout to a compact CNN improves classification when both variants use the same data split, depth, width, optimizer, and training schedule. Model selection uses validation accuracy; accuracy and class-sensitive metrics on held-out images describe the final model's performance.</w:t>
       </w:r>
     </w:p>
     <w:tbl>
@@ -35,13 +40,13 @@
         <w:tblLook w:firstColumn="1" w:firstRow="1" w:lastColumn="0" w:lastRow="0" w:noHBand="0" w:noVBand="1" w:val="04A0"/>
       </w:tblPr>
       <w:tblGrid>
-        <w:gridCol w:w="4320"/>
-        <w:gridCol w:w="4320"/>
+        <w:gridCol w:w="5040"/>
+        <w:gridCol w:w="5040"/>
       </w:tblGrid>
       <w:tr>
         <w:tc>
           <w:tcPr>
-            <w:tcW w:type="dxa" w:w="4320"/>
+            <w:tcW w:type="dxa" w:w="5040"/>
           </w:tcPr>
           <w:p>
             <w:r>
@@ -51,7 +56,7 @@
         </w:tc>
         <w:tc>
           <w:tcPr>
-            <w:tcW w:type="dxa" w:w="4320"/>
+            <w:tcW w:type="dxa" w:w="5040"/>
           </w:tcPr>
           <w:p>
             <w:r>
@@ -63,7 +68,7 @@
       <w:tr>
         <w:tc>
           <w:tcPr>
-            <w:tcW w:type="dxa" w:w="4320"/>
+            <w:tcW w:type="dxa" w:w="5040"/>
           </w:tcPr>
           <w:p>
             <w:r>
@@ -73,7 +78,7 @@
         </w:tc>
         <w:tc>
           <w:tcPr>
-            <w:tcW w:type="dxa" w:w="4320"/>
+            <w:tcW w:type="dxa" w:w="5040"/>
           </w:tcPr>
           <w:p>
             <w:r>
@@ -85,7 +90,7 @@
       <w:tr>
         <w:tc>
           <w:tcPr>
-            <w:tcW w:type="dxa" w:w="4320"/>
+            <w:tcW w:type="dxa" w:w="5040"/>
           </w:tcPr>
           <w:p>
             <w:r>
@@ -95,7 +100,7 @@
         </w:tc>
         <w:tc>
           <w:tcPr>
-            <w:tcW w:type="dxa" w:w="4320"/>
+            <w:tcW w:type="dxa" w:w="5040"/>
           </w:tcPr>
           <w:p>
             <w:r>
@@ -107,7 +112,7 @@
       <w:tr>
         <w:tc>
           <w:tcPr>
-            <w:tcW w:type="dxa" w:w="4320"/>
+            <w:tcW w:type="dxa" w:w="5040"/>
           </w:tcPr>
           <w:p>
             <w:r>
@@ -117,7 +122,7 @@
         </w:tc>
         <w:tc>
           <w:tcPr>
-            <w:tcW w:type="dxa" w:w="4320"/>
+            <w:tcW w:type="dxa" w:w="5040"/>
           </w:tcPr>
           <w:p>
             <w:r>
@@ -129,7 +134,7 @@
       <w:tr>
         <w:tc>
           <w:tcPr>
-            <w:tcW w:type="dxa" w:w="4320"/>
+            <w:tcW w:type="dxa" w:w="5040"/>
           </w:tcPr>
           <w:p>
             <w:r>
@@ -139,7 +144,7 @@
         </w:tc>
         <w:tc>
           <w:tcPr>
-            <w:tcW w:type="dxa" w:w="4320"/>
+            <w:tcW w:type="dxa" w:w="5040"/>
           </w:tcPr>
           <w:p>
             <w:r>
@@ -151,7 +156,7 @@
       <w:tr>
         <w:tc>
           <w:tcPr>
-            <w:tcW w:type="dxa" w:w="4320"/>
+            <w:tcW w:type="dxa" w:w="5040"/>
           </w:tcPr>
           <w:p>
             <w:r>
@@ -161,7 +166,7 @@
         </w:tc>
         <w:tc>
           <w:tcPr>
-            <w:tcW w:type="dxa" w:w="4320"/>
+            <w:tcW w:type="dxa" w:w="5040"/>
           </w:tcPr>
           <w:p>
             <w:r>
@@ -173,7 +178,7 @@
       <w:tr>
         <w:tc>
           <w:tcPr>
-            <w:tcW w:type="dxa" w:w="4320"/>
+            <w:tcW w:type="dxa" w:w="5040"/>
           </w:tcPr>
           <w:p>
             <w:r>
@@ -183,7 +188,7 @@
         </w:tc>
         <w:tc>
           <w:tcPr>
-            <w:tcW w:type="dxa" w:w="4320"/>
+            <w:tcW w:type="dxa" w:w="5040"/>
           </w:tcPr>
           <w:p>
             <w:r>
@@ -195,7 +200,7 @@
       <w:tr>
         <w:tc>
           <w:tcPr>
-            <w:tcW w:type="dxa" w:w="4320"/>
+            <w:tcW w:type="dxa" w:w="5040"/>
           </w:tcPr>
           <w:p>
             <w:r>
@@ -205,7 +210,7 @@
         </w:tc>
         <w:tc>
           <w:tcPr>
-            <w:tcW w:type="dxa" w:w="4320"/>
+            <w:tcW w:type="dxa" w:w="5040"/>
           </w:tcPr>
           <w:p>
             <w:r>
@@ -217,7 +222,7 @@
       <w:tr>
         <w:tc>
           <w:tcPr>
-            <w:tcW w:type="dxa" w:w="4320"/>
+            <w:tcW w:type="dxa" w:w="5040"/>
           </w:tcPr>
           <w:p>
             <w:r>
@@ -227,7 +232,7 @@
         </w:tc>
         <w:tc>
           <w:tcPr>
-            <w:tcW w:type="dxa" w:w="4320"/>
+            <w:tcW w:type="dxa" w:w="5040"/>
           </w:tcPr>
           <w:p>
             <w:r>
@@ -237,6 +242,47 @@
         </w:tc>
       </w:tr>
     </w:tbl>
+    <w:p>
+      <w:r>
+        <w:drawing>
+          <wp:inline xmlns:a="http://schemas.openxmlformats.org/drawingml/2006/main" xmlns:pic="http://schemas.openxmlformats.org/drawingml/2006/picture">
+            <wp:extent cx="6217920" cy="3086076"/>
+            <wp:docPr id="1" name="Picture 1"/>
+            <wp:cNvGraphicFramePr>
+              <a:graphicFrameLocks noChangeAspect="1"/>
+            </wp:cNvGraphicFramePr>
+            <a:graphic>
+              <a:graphicData uri="http://schemas.openxmlformats.org/drawingml/2006/picture">
+                <pic:pic>
+                  <pic:nvPicPr>
+                    <pic:cNvPr id="0" name="dataset_overview.png"/>
+                    <pic:cNvPicPr/>
+                  </pic:nvPicPr>
+                  <pic:blipFill>
+                    <a:blip r:embed="rId9"/>
+                    <a:stretch>
+                      <a:fillRect/>
+                    </a:stretch>
+                  </pic:blipFill>
+                  <pic:spPr>
+                    <a:xfrm>
+                      <a:off x="0" y="0"/>
+                      <a:ext cx="6217920" cy="3086076"/>
+                    </a:xfrm>
+                    <a:prstGeom prst="rect"/>
+                  </pic:spPr>
+                </pic:pic>
+              </a:graphicData>
+            </a:graphic>
+          </wp:inline>
+        </w:drawing>
+      </w:r>
+    </w:p>
+    <w:p>
+      <w:r>
+        <w:t>Figure 1. Natural Images class counts and one example image from each category. Class frequencies range from 702 dogs to 1,000 fruit images.</w:t>
+      </w:r>
+    </w:p>
     <w:p>
       <w:pPr>
         <w:pStyle w:val="Heading1"/>
@@ -255,7 +301,12 @@
     </w:p>
     <w:p>
       <w:r>
-        <w:t>Images were divided with stratified random sampling (seed 42) into 4829 training, 1035 validation, and 1035 test examples (70/15/15). The test set was held out until model selection was complete. All images were converted to RGB, resized to 48 x 48 pixels, and scaled from 0-255 to 0-1. Training images alone received random horizontal flips and brightness changes (factor 0.85-1.15).</w:t>
+        <w:t>Images were divided with stratified random sampling (seed 42) into 4829 training, 1035 validation, and 1035 test examples (70/15/15). Validation accuracy selected the architecture; its checkpoint was then evaluated on the test set before the later tuning sweep. All images were converted to RGB, resized to 48 x 48 pixels, and scaled from 0-255 to 0-1. Training images alone received random horizontal flips and brightness changes (factor 0.85-1.15).</w:t>
+      </w:r>
+    </w:p>
+    <w:p>
+      <w:r>
+        <w:t>Class labels were inferred from the eight folder names. The training loader shuffles images; validation and test images receive deterministic resizing and scaling only. The stratified split preserves the unequal class frequencies across subsets.</w:t>
       </w:r>
     </w:p>
     <w:p>
@@ -268,15 +319,15 @@
     </w:p>
     <w:p>
       <w:r>
-        <w:t>Both networks use three 3x3 convolution blocks with 16, 32, and 64 output channels. Each block has ReLU and 2x2 max pooling. Global average pooling maps each channel to one value, followed by a linear eight-class classifier. The regularized variant adds batch normalization after every convolution and 30% dropout before the classifier. The baseline omits both. This comparison isolates the effect of regularization while keeping network width and depth fixed.</w:t>
+        <w:t>Both networks use three 3x3 convolution blocks with 16, 32, and 64 output channels. Each block has ReLU and 2x2 max pooling. Global average pooling maps each channel to one value, followed by a linear eight-class classifier. The regularized variant adds batch normalization after every convolution and 30% dropout before the classifier. The baseline omits both. This comparison tests the combined design change while keeping network width and depth fixed.</w:t>
       </w:r>
     </w:p>
     <w:p>
       <w:r>
         <w:drawing>
           <wp:inline xmlns:a="http://schemas.openxmlformats.org/drawingml/2006/main" xmlns:pic="http://schemas.openxmlformats.org/drawingml/2006/picture">
-            <wp:extent cx="6400800" cy="848299"/>
-            <wp:docPr id="1" name="Picture 1"/>
+            <wp:extent cx="6309360" cy="836180"/>
+            <wp:docPr id="2" name="Picture 2"/>
             <wp:cNvGraphicFramePr>
               <a:graphicFrameLocks noChangeAspect="1"/>
             </wp:cNvGraphicFramePr>
@@ -288,7 +339,7 @@
                     <pic:cNvPicPr/>
                   </pic:nvPicPr>
                   <pic:blipFill>
-                    <a:blip r:embed="rId9"/>
+                    <a:blip r:embed="rId10"/>
                     <a:stretch>
                       <a:fillRect/>
                     </a:stretch>
@@ -296,7 +347,7 @@
                   <pic:spPr>
                     <a:xfrm>
                       <a:off x="0" y="0"/>
-                      <a:ext cx="6400800" cy="848299"/>
+                      <a:ext cx="6309360" cy="836180"/>
                     </a:xfrm>
                     <a:prstGeom prst="rect"/>
                   </pic:spPr>
@@ -309,7 +360,7 @@
     </w:p>
     <w:p>
       <w:r>
-        <w:t>Figure 1. Shared CNN architecture. The regularized variant additionally applies batch normalization and dropout as noted in each block.</w:t>
+        <w:t>Figure 2. Shared CNN architecture. The regularized variant additionally applies batch normalization and dropout as noted in each block.</w:t>
       </w:r>
     </w:p>
     <w:p>
@@ -323,6 +374,198 @@
     <w:p>
       <w:r>
         <w:t>Both variants were trained for 3 epochs using cross entropy loss, Adam with learning rate 0.001, and batch size 64. The checkpoint with the highest validation accuracy for each variant was saved; the variant with the higher validation accuracy was selected. Ties favor the baseline. Training ran on cpu. No test labels were used for optimization. These starting hyperparameters were then tuned by a grid search over learning rate and dropout rate, reported and justified in the Discussion section.</w:t>
+      </w:r>
+    </w:p>
+    <w:tbl>
+      <w:tblPr>
+        <w:tblStyle w:val="LightShading-Accent1"/>
+        <w:tblW w:type="auto" w:w="0"/>
+        <w:tblLook w:firstColumn="1" w:firstRow="1" w:lastColumn="0" w:lastRow="0" w:noHBand="0" w:noVBand="1" w:val="04A0"/>
+      </w:tblPr>
+      <w:tblGrid>
+        <w:gridCol w:w="5040"/>
+        <w:gridCol w:w="5040"/>
+      </w:tblGrid>
+      <w:tr>
+        <w:tc>
+          <w:tcPr>
+            <w:tcW w:type="dxa" w:w="5040"/>
+          </w:tcPr>
+          <w:p>
+            <w:r>
+              <w:t>Setting</w:t>
+            </w:r>
+          </w:p>
+        </w:tc>
+        <w:tc>
+          <w:tcPr>
+            <w:tcW w:type="dxa" w:w="5040"/>
+          </w:tcPr>
+          <w:p>
+            <w:r>
+              <w:t>Value</w:t>
+            </w:r>
+          </w:p>
+        </w:tc>
+      </w:tr>
+      <w:tr>
+        <w:tc>
+          <w:tcPr>
+            <w:tcW w:type="dxa" w:w="5040"/>
+          </w:tcPr>
+          <w:p>
+            <w:r>
+              <w:t>Framework / device</w:t>
+            </w:r>
+          </w:p>
+        </w:tc>
+        <w:tc>
+          <w:tcPr>
+            <w:tcW w:type="dxa" w:w="5040"/>
+          </w:tcPr>
+          <w:p>
+            <w:r>
+              <w:t>PyTorch / cpu</w:t>
+            </w:r>
+          </w:p>
+        </w:tc>
+      </w:tr>
+      <w:tr>
+        <w:tc>
+          <w:tcPr>
+            <w:tcW w:type="dxa" w:w="5040"/>
+          </w:tcPr>
+          <w:p>
+            <w:r>
+              <w:t>Input</w:t>
+            </w:r>
+          </w:p>
+        </w:tc>
+        <w:tc>
+          <w:tcPr>
+            <w:tcW w:type="dxa" w:w="5040"/>
+          </w:tcPr>
+          <w:p>
+            <w:r>
+              <w:t>RGB, 48 × 48 pixels; values 0–1</w:t>
+            </w:r>
+          </w:p>
+        </w:tc>
+      </w:tr>
+      <w:tr>
+        <w:tc>
+          <w:tcPr>
+            <w:tcW w:type="dxa" w:w="5040"/>
+          </w:tcPr>
+          <w:p>
+            <w:r>
+              <w:t>Optimizer / loss</w:t>
+            </w:r>
+          </w:p>
+        </w:tc>
+        <w:tc>
+          <w:tcPr>
+            <w:tcW w:type="dxa" w:w="5040"/>
+          </w:tcPr>
+          <w:p>
+            <w:r>
+              <w:t>Adam / cross entropy</w:t>
+            </w:r>
+          </w:p>
+        </w:tc>
+      </w:tr>
+      <w:tr>
+        <w:tc>
+          <w:tcPr>
+            <w:tcW w:type="dxa" w:w="5040"/>
+          </w:tcPr>
+          <w:p>
+            <w:r>
+              <w:t>Initial learning rate</w:t>
+            </w:r>
+          </w:p>
+        </w:tc>
+        <w:tc>
+          <w:tcPr>
+            <w:tcW w:type="dxa" w:w="5040"/>
+          </w:tcPr>
+          <w:p>
+            <w:r>
+              <w:t>0.001</w:t>
+            </w:r>
+          </w:p>
+        </w:tc>
+      </w:tr>
+      <w:tr>
+        <w:tc>
+          <w:tcPr>
+            <w:tcW w:type="dxa" w:w="5040"/>
+          </w:tcPr>
+          <w:p>
+            <w:r>
+              <w:t>Batch size / epochs</w:t>
+            </w:r>
+          </w:p>
+        </w:tc>
+        <w:tc>
+          <w:tcPr>
+            <w:tcW w:type="dxa" w:w="5040"/>
+          </w:tcPr>
+          <w:p>
+            <w:r>
+              <w:t>64 / 3 per architecture</w:t>
+            </w:r>
+          </w:p>
+        </w:tc>
+      </w:tr>
+      <w:tr>
+        <w:tc>
+          <w:tcPr>
+            <w:tcW w:type="dxa" w:w="5040"/>
+          </w:tcPr>
+          <w:p>
+            <w:r>
+              <w:t>Regularized variant</w:t>
+            </w:r>
+          </w:p>
+        </w:tc>
+        <w:tc>
+          <w:tcPr>
+            <w:tcW w:type="dxa" w:w="5040"/>
+          </w:tcPr>
+          <w:p>
+            <w:r>
+              <w:t>Batch normalization; 30% dropout</w:t>
+            </w:r>
+          </w:p>
+        </w:tc>
+      </w:tr>
+      <w:tr>
+        <w:tc>
+          <w:tcPr>
+            <w:tcW w:type="dxa" w:w="5040"/>
+          </w:tcPr>
+          <w:p>
+            <w:r>
+              <w:t>Random seed / selection</w:t>
+            </w:r>
+          </w:p>
+        </w:tc>
+        <w:tc>
+          <w:tcPr>
+            <w:tcW w:type="dxa" w:w="5040"/>
+          </w:tcPr>
+          <w:p>
+            <w:r>
+              <w:t>42 / highest validation accuracy</w:t>
+            </w:r>
+          </w:p>
+        </w:tc>
+      </w:tr>
+    </w:tbl>
+    <w:p>
+      <w:r>
+        <w:t>Starting from the winning architecture, learning rate and dropout were tuned by a two-stage grid search, each run for 3 epochs and scored by validation accuracy. First, the learning rate was swept with dropout fixed at its original value; then dropout was swept at the best learning rate found. This keeps the search small (six training runs, including one repeated configuration) while probing both an optimization and a regularization hyperparameter.</w:t>
       </w:r>
     </w:p>
     <w:p>
@@ -368,16 +611,16 @@
         <w:tblLook w:firstColumn="1" w:firstRow="1" w:lastColumn="0" w:lastRow="0" w:noHBand="0" w:noVBand="1" w:val="04A0"/>
       </w:tblPr>
       <w:tblGrid>
-        <w:gridCol w:w="1728"/>
-        <w:gridCol w:w="1728"/>
-        <w:gridCol w:w="1728"/>
-        <w:gridCol w:w="1728"/>
-        <w:gridCol w:w="1728"/>
+        <w:gridCol w:w="2016"/>
+        <w:gridCol w:w="2016"/>
+        <w:gridCol w:w="2016"/>
+        <w:gridCol w:w="2016"/>
+        <w:gridCol w:w="2016"/>
       </w:tblGrid>
       <w:tr>
         <w:tc>
           <w:tcPr>
-            <w:tcW w:type="dxa" w:w="1728"/>
+            <w:tcW w:type="dxa" w:w="2016"/>
           </w:tcPr>
           <w:p>
             <w:r>
@@ -387,7 +630,7 @@
         </w:tc>
         <w:tc>
           <w:tcPr>
-            <w:tcW w:type="dxa" w:w="1728"/>
+            <w:tcW w:type="dxa" w:w="2016"/>
           </w:tcPr>
           <w:p>
             <w:r>
@@ -397,7 +640,7 @@
         </w:tc>
         <w:tc>
           <w:tcPr>
-            <w:tcW w:type="dxa" w:w="1728"/>
+            <w:tcW w:type="dxa" w:w="2016"/>
           </w:tcPr>
           <w:p>
             <w:r>
@@ -407,7 +650,7 @@
         </w:tc>
         <w:tc>
           <w:tcPr>
-            <w:tcW w:type="dxa" w:w="1728"/>
+            <w:tcW w:type="dxa" w:w="2016"/>
           </w:tcPr>
           <w:p>
             <w:r>
@@ -417,7 +660,7 @@
         </w:tc>
         <w:tc>
           <w:tcPr>
-            <w:tcW w:type="dxa" w:w="1728"/>
+            <w:tcW w:type="dxa" w:w="2016"/>
           </w:tcPr>
           <w:p>
             <w:r>
@@ -429,7 +672,7 @@
       <w:tr>
         <w:tc>
           <w:tcPr>
-            <w:tcW w:type="dxa" w:w="1728"/>
+            <w:tcW w:type="dxa" w:w="2016"/>
           </w:tcPr>
           <w:p>
             <w:r>
@@ -439,7 +682,7 @@
         </w:tc>
         <w:tc>
           <w:tcPr>
-            <w:tcW w:type="dxa" w:w="1728"/>
+            <w:tcW w:type="dxa" w:w="2016"/>
           </w:tcPr>
           <w:p>
             <w:r>
@@ -449,7 +692,7 @@
         </w:tc>
         <w:tc>
           <w:tcPr>
-            <w:tcW w:type="dxa" w:w="1728"/>
+            <w:tcW w:type="dxa" w:w="2016"/>
           </w:tcPr>
           <w:p>
             <w:r>
@@ -459,7 +702,7 @@
         </w:tc>
         <w:tc>
           <w:tcPr>
-            <w:tcW w:type="dxa" w:w="1728"/>
+            <w:tcW w:type="dxa" w:w="2016"/>
           </w:tcPr>
           <w:p>
             <w:r>
@@ -469,7 +712,7 @@
         </w:tc>
         <w:tc>
           <w:tcPr>
-            <w:tcW w:type="dxa" w:w="1728"/>
+            <w:tcW w:type="dxa" w:w="2016"/>
           </w:tcPr>
           <w:p>
             <w:r>
@@ -481,7 +724,7 @@
       <w:tr>
         <w:tc>
           <w:tcPr>
-            <w:tcW w:type="dxa" w:w="1728"/>
+            <w:tcW w:type="dxa" w:w="2016"/>
           </w:tcPr>
           <w:p>
             <w:r>
@@ -491,7 +734,7 @@
         </w:tc>
         <w:tc>
           <w:tcPr>
-            <w:tcW w:type="dxa" w:w="1728"/>
+            <w:tcW w:type="dxa" w:w="2016"/>
           </w:tcPr>
           <w:p>
             <w:r>
@@ -501,7 +744,7 @@
         </w:tc>
         <w:tc>
           <w:tcPr>
-            <w:tcW w:type="dxa" w:w="1728"/>
+            <w:tcW w:type="dxa" w:w="2016"/>
           </w:tcPr>
           <w:p>
             <w:r>
@@ -511,7 +754,7 @@
         </w:tc>
         <w:tc>
           <w:tcPr>
-            <w:tcW w:type="dxa" w:w="1728"/>
+            <w:tcW w:type="dxa" w:w="2016"/>
           </w:tcPr>
           <w:p>
             <w:r>
@@ -521,7 +764,7 @@
         </w:tc>
         <w:tc>
           <w:tcPr>
-            <w:tcW w:type="dxa" w:w="1728"/>
+            <w:tcW w:type="dxa" w:w="2016"/>
           </w:tcPr>
           <w:p>
             <w:r>
@@ -533,7 +776,7 @@
       <w:tr>
         <w:tc>
           <w:tcPr>
-            <w:tcW w:type="dxa" w:w="1728"/>
+            <w:tcW w:type="dxa" w:w="2016"/>
           </w:tcPr>
           <w:p>
             <w:r>
@@ -543,7 +786,7 @@
         </w:tc>
         <w:tc>
           <w:tcPr>
-            <w:tcW w:type="dxa" w:w="1728"/>
+            <w:tcW w:type="dxa" w:w="2016"/>
           </w:tcPr>
           <w:p>
             <w:r>
@@ -553,7 +796,7 @@
         </w:tc>
         <w:tc>
           <w:tcPr>
-            <w:tcW w:type="dxa" w:w="1728"/>
+            <w:tcW w:type="dxa" w:w="2016"/>
           </w:tcPr>
           <w:p>
             <w:r>
@@ -563,7 +806,7 @@
         </w:tc>
         <w:tc>
           <w:tcPr>
-            <w:tcW w:type="dxa" w:w="1728"/>
+            <w:tcW w:type="dxa" w:w="2016"/>
           </w:tcPr>
           <w:p>
             <w:r>
@@ -573,7 +816,7 @@
         </w:tc>
         <w:tc>
           <w:tcPr>
-            <w:tcW w:type="dxa" w:w="1728"/>
+            <w:tcW w:type="dxa" w:w="2016"/>
           </w:tcPr>
           <w:p>
             <w:r>
@@ -585,7 +828,7 @@
       <w:tr>
         <w:tc>
           <w:tcPr>
-            <w:tcW w:type="dxa" w:w="1728"/>
+            <w:tcW w:type="dxa" w:w="2016"/>
           </w:tcPr>
           <w:p>
             <w:r>
@@ -595,7 +838,7 @@
         </w:tc>
         <w:tc>
           <w:tcPr>
-            <w:tcW w:type="dxa" w:w="1728"/>
+            <w:tcW w:type="dxa" w:w="2016"/>
           </w:tcPr>
           <w:p>
             <w:r>
@@ -605,7 +848,7 @@
         </w:tc>
         <w:tc>
           <w:tcPr>
-            <w:tcW w:type="dxa" w:w="1728"/>
+            <w:tcW w:type="dxa" w:w="2016"/>
           </w:tcPr>
           <w:p>
             <w:r>
@@ -615,7 +858,7 @@
         </w:tc>
         <w:tc>
           <w:tcPr>
-            <w:tcW w:type="dxa" w:w="1728"/>
+            <w:tcW w:type="dxa" w:w="2016"/>
           </w:tcPr>
           <w:p>
             <w:r>
@@ -625,7 +868,7 @@
         </w:tc>
         <w:tc>
           <w:tcPr>
-            <w:tcW w:type="dxa" w:w="1728"/>
+            <w:tcW w:type="dxa" w:w="2016"/>
           </w:tcPr>
           <w:p>
             <w:r>
@@ -637,7 +880,7 @@
       <w:tr>
         <w:tc>
           <w:tcPr>
-            <w:tcW w:type="dxa" w:w="1728"/>
+            <w:tcW w:type="dxa" w:w="2016"/>
           </w:tcPr>
           <w:p>
             <w:r>
@@ -647,7 +890,7 @@
         </w:tc>
         <w:tc>
           <w:tcPr>
-            <w:tcW w:type="dxa" w:w="1728"/>
+            <w:tcW w:type="dxa" w:w="2016"/>
           </w:tcPr>
           <w:p>
             <w:r>
@@ -657,7 +900,7 @@
         </w:tc>
         <w:tc>
           <w:tcPr>
-            <w:tcW w:type="dxa" w:w="1728"/>
+            <w:tcW w:type="dxa" w:w="2016"/>
           </w:tcPr>
           <w:p>
             <w:r>
@@ -667,7 +910,7 @@
         </w:tc>
         <w:tc>
           <w:tcPr>
-            <w:tcW w:type="dxa" w:w="1728"/>
+            <w:tcW w:type="dxa" w:w="2016"/>
           </w:tcPr>
           <w:p>
             <w:r>
@@ -677,7 +920,7 @@
         </w:tc>
         <w:tc>
           <w:tcPr>
-            <w:tcW w:type="dxa" w:w="1728"/>
+            <w:tcW w:type="dxa" w:w="2016"/>
           </w:tcPr>
           <w:p>
             <w:r>
@@ -689,7 +932,7 @@
       <w:tr>
         <w:tc>
           <w:tcPr>
-            <w:tcW w:type="dxa" w:w="1728"/>
+            <w:tcW w:type="dxa" w:w="2016"/>
           </w:tcPr>
           <w:p>
             <w:r>
@@ -699,7 +942,7 @@
         </w:tc>
         <w:tc>
           <w:tcPr>
-            <w:tcW w:type="dxa" w:w="1728"/>
+            <w:tcW w:type="dxa" w:w="2016"/>
           </w:tcPr>
           <w:p>
             <w:r>
@@ -709,7 +952,7 @@
         </w:tc>
         <w:tc>
           <w:tcPr>
-            <w:tcW w:type="dxa" w:w="1728"/>
+            <w:tcW w:type="dxa" w:w="2016"/>
           </w:tcPr>
           <w:p>
             <w:r>
@@ -719,7 +962,7 @@
         </w:tc>
         <w:tc>
           <w:tcPr>
-            <w:tcW w:type="dxa" w:w="1728"/>
+            <w:tcW w:type="dxa" w:w="2016"/>
           </w:tcPr>
           <w:p>
             <w:r>
@@ -729,7 +972,7 @@
         </w:tc>
         <w:tc>
           <w:tcPr>
-            <w:tcW w:type="dxa" w:w="1728"/>
+            <w:tcW w:type="dxa" w:w="2016"/>
           </w:tcPr>
           <w:p>
             <w:r>
@@ -741,7 +984,7 @@
       <w:tr>
         <w:tc>
           <w:tcPr>
-            <w:tcW w:type="dxa" w:w="1728"/>
+            <w:tcW w:type="dxa" w:w="2016"/>
           </w:tcPr>
           <w:p>
             <w:r>
@@ -751,7 +994,7 @@
         </w:tc>
         <w:tc>
           <w:tcPr>
-            <w:tcW w:type="dxa" w:w="1728"/>
+            <w:tcW w:type="dxa" w:w="2016"/>
           </w:tcPr>
           <w:p>
             <w:r>
@@ -761,7 +1004,7 @@
         </w:tc>
         <w:tc>
           <w:tcPr>
-            <w:tcW w:type="dxa" w:w="1728"/>
+            <w:tcW w:type="dxa" w:w="2016"/>
           </w:tcPr>
           <w:p>
             <w:r>
@@ -771,7 +1014,7 @@
         </w:tc>
         <w:tc>
           <w:tcPr>
-            <w:tcW w:type="dxa" w:w="1728"/>
+            <w:tcW w:type="dxa" w:w="2016"/>
           </w:tcPr>
           <w:p>
             <w:r>
@@ -781,7 +1024,7 @@
         </w:tc>
         <w:tc>
           <w:tcPr>
-            <w:tcW w:type="dxa" w:w="1728"/>
+            <w:tcW w:type="dxa" w:w="2016"/>
           </w:tcPr>
           <w:p>
             <w:r>
@@ -793,7 +1036,7 @@
       <w:tr>
         <w:tc>
           <w:tcPr>
-            <w:tcW w:type="dxa" w:w="1728"/>
+            <w:tcW w:type="dxa" w:w="2016"/>
           </w:tcPr>
           <w:p>
             <w:r>
@@ -803,7 +1046,7 @@
         </w:tc>
         <w:tc>
           <w:tcPr>
-            <w:tcW w:type="dxa" w:w="1728"/>
+            <w:tcW w:type="dxa" w:w="2016"/>
           </w:tcPr>
           <w:p>
             <w:r>
@@ -813,7 +1056,7 @@
         </w:tc>
         <w:tc>
           <w:tcPr>
-            <w:tcW w:type="dxa" w:w="1728"/>
+            <w:tcW w:type="dxa" w:w="2016"/>
           </w:tcPr>
           <w:p>
             <w:r>
@@ -823,7 +1066,7 @@
         </w:tc>
         <w:tc>
           <w:tcPr>
-            <w:tcW w:type="dxa" w:w="1728"/>
+            <w:tcW w:type="dxa" w:w="2016"/>
           </w:tcPr>
           <w:p>
             <w:r>
@@ -833,7 +1076,7 @@
         </w:tc>
         <w:tc>
           <w:tcPr>
-            <w:tcW w:type="dxa" w:w="1728"/>
+            <w:tcW w:type="dxa" w:w="2016"/>
           </w:tcPr>
           <w:p>
             <w:r>
@@ -856,7 +1099,7 @@
         <w:drawing>
           <wp:inline xmlns:a="http://schemas.openxmlformats.org/drawingml/2006/main" xmlns:pic="http://schemas.openxmlformats.org/drawingml/2006/picture">
             <wp:extent cx="5120640" cy="4389120"/>
-            <wp:docPr id="2" name="Picture 2"/>
+            <wp:docPr id="3" name="Picture 3"/>
             <wp:cNvGraphicFramePr>
               <a:graphicFrameLocks noChangeAspect="1"/>
             </wp:cNvGraphicFramePr>
@@ -868,7 +1111,7 @@
                     <pic:cNvPicPr/>
                   </pic:nvPicPr>
                   <pic:blipFill>
-                    <a:blip r:embed="rId10"/>
+                    <a:blip r:embed="rId11"/>
                     <a:stretch>
                       <a:fillRect/>
                     </a:stretch>
@@ -889,7 +1132,7 @@
     </w:p>
     <w:p>
       <w:r>
-        <w:t>Figure 2. Confusion matrix for the selected model on the held-out test set. Rows are true labels; columns are predictions.</w:t>
+        <w:t>Figure 3. Confusion matrix for the selected model on the held-out test set. Rows are true labels; columns are predictions.</w:t>
       </w:r>
     </w:p>
     <w:p>
@@ -905,7 +1148,7 @@
         <w:drawing>
           <wp:inline xmlns:a="http://schemas.openxmlformats.org/drawingml/2006/main" xmlns:pic="http://schemas.openxmlformats.org/drawingml/2006/picture">
             <wp:extent cx="5669280" cy="2267712"/>
-            <wp:docPr id="3" name="Picture 3"/>
+            <wp:docPr id="4" name="Picture 4"/>
             <wp:cNvGraphicFramePr>
               <a:graphicFrameLocks noChangeAspect="1"/>
             </wp:cNvGraphicFramePr>
@@ -917,7 +1160,7 @@
                     <pic:cNvPicPr/>
                   </pic:nvPicPr>
                   <pic:blipFill>
-                    <a:blip r:embed="rId11"/>
+                    <a:blip r:embed="rId12"/>
                     <a:stretch>
                       <a:fillRect/>
                     </a:stretch>
@@ -938,7 +1181,61 @@
     </w:p>
     <w:p>
       <w:r>
-        <w:t>Figure 3. Training and validation loss and accuracy for both CNN variants. Each dashed line is validation performance.</w:t>
+        <w:t>Figure 4. Training and validation loss and accuracy for both CNN variants. Each dashed line is validation performance.</w:t>
+      </w:r>
+    </w:p>
+    <w:p>
+      <w:r>
+        <w:t>Across three epochs, baseline validation accuracy rose from 40.2% to 54.7%, while the regularized variant rose from 63.6% to 75.6%. Validation losses declined for both models over the observed training period; the curves do not establish convergence after only three epochs.</w:t>
+      </w:r>
+    </w:p>
+    <w:p>
+      <w:pPr>
+        <w:pStyle w:val="Heading2"/>
+      </w:pPr>
+      <w:r>
+        <w:t>Visual summary</w:t>
+      </w:r>
+    </w:p>
+    <w:p>
+      <w:r>
+        <w:drawing>
+          <wp:inline xmlns:a="http://schemas.openxmlformats.org/drawingml/2006/main" xmlns:pic="http://schemas.openxmlformats.org/drawingml/2006/picture">
+            <wp:extent cx="6035040" cy="4019114"/>
+            <wp:docPr id="5" name="Picture 5"/>
+            <wp:cNvGraphicFramePr>
+              <a:graphicFrameLocks noChangeAspect="1"/>
+            </wp:cNvGraphicFramePr>
+            <a:graphic>
+              <a:graphicData uri="http://schemas.openxmlformats.org/drawingml/2006/picture">
+                <pic:pic>
+                  <pic:nvPicPr>
+                    <pic:cNvPr id="0" name="performance_dashboard.png"/>
+                    <pic:cNvPicPr/>
+                  </pic:nvPicPr>
+                  <pic:blipFill>
+                    <a:blip r:embed="rId13"/>
+                    <a:stretch>
+                      <a:fillRect/>
+                    </a:stretch>
+                  </pic:blipFill>
+                  <pic:spPr>
+                    <a:xfrm>
+                      <a:off x="0" y="0"/>
+                      <a:ext cx="6035040" cy="4019114"/>
+                    </a:xfrm>
+                    <a:prstGeom prst="rect"/>
+                  </pic:spPr>
+                </pic:pic>
+              </a:graphicData>
+            </a:graphic>
+          </wp:inline>
+        </w:drawing>
+      </w:r>
+    </w:p>
+    <w:p>
+      <w:r>
+        <w:t>Figure 5. Validation architecture comparison, held-out class metrics, aggregate test metrics, and separate learning-rate and dropout sweeps.</w:t>
       </w:r>
     </w:p>
     <w:p>
@@ -964,7 +1261,7 @@
     </w:p>
     <w:p>
       <w:r>
-        <w:t>The main practical challenge was keeping training time reasonable on a CPU-only machine: images were downsized to 48x48 and the network kept to three convolution blocks so that a full architecture comparison plus a hyperparameter search could still complete in well under an hour. A second challenge was noise in short training runs — with only 3 epochs per configuration and a 1035-image validation set, a single run's best-epoch accuracy can swing several points between otherwise identical settings (see the hyperparameter search below), which complicates picking a clear winner from a small number of runs.</w:t>
+        <w:t>Training used a CPU, so images were resized to 48x48 and the CNN was limited to three convolution blocks. With 3 epochs per run, neither learning curve proves convergence. The baseline's lower training and validation accuracy suggests that optimization and model capacity, as well as regularization, could affect the observed gap. The repeated learning-rate/dropout setting produced different validation scores in the two search stages; this illustrates uncertainty from short stochastic runs, but two observations are insufficient to estimate run-to-run variance reliably.</w:t>
       </w:r>
     </w:p>
     <w:p>
@@ -977,12 +1274,7 @@
     </w:p>
     <w:p>
       <w:r>
-        <w:t>The regularized architecture (batch normalization + 30% dropout) was selected over the baseline because it reached 75.556% best validation accuracy versus 54.686% for the baseline under identical data, epochs, and optimizer settings. Batch normalization stabilizes the input distribution to each layer, and dropout reduces overfitting on a training set of under 5,000 images; the gap between the two variants' training curves (below) shows the baseline both learning more slowly and generalizing worse. Global average pooling was used instead of a flattened dense layer to keep the parameter count small and the network size-invariant to any input resolution.</w:t>
-      </w:r>
-    </w:p>
-    <w:p>
-      <w:r>
-        <w:t>Starting from the winning architecture, learning rate and dropout were tuned by a two-stage grid search, each run for 3 epochs and scored by validation accuracy. First, the learning rate was swept with dropout fixed at its original value; then dropout was swept at the best learning rate found. This keeps the search small (six total configurations) while still probing both an optimization hyperparameter and a regularization hyperparameter.</w:t>
+        <w:t>The combined batch-normalization and 30%-dropout architecture was selected over the baseline because it reached 75.556% best validation accuracy versus 54.686% for the baseline under identical data, epochs, and optimizer settings. Batch normalization normalizes minibatch activations; dropout randomly removes classifier inputs during training. Because both were introduced together, these experiments do not isolate either component's individual contribution. Global average pooling limits classifier parameters compared with flattening a full feature map, which suits the small training set and CPU budget.</w:t>
       </w:r>
     </w:p>
     <w:tbl>
@@ -992,13 +1284,13 @@
         <w:tblLook w:firstColumn="1" w:firstRow="1" w:lastColumn="0" w:lastRow="0" w:noHBand="0" w:noVBand="1" w:val="04A0"/>
       </w:tblPr>
       <w:tblGrid>
-        <w:gridCol w:w="4320"/>
-        <w:gridCol w:w="4320"/>
+        <w:gridCol w:w="5040"/>
+        <w:gridCol w:w="5040"/>
       </w:tblGrid>
       <w:tr>
         <w:tc>
           <w:tcPr>
-            <w:tcW w:type="dxa" w:w="4320"/>
+            <w:tcW w:type="dxa" w:w="5040"/>
           </w:tcPr>
           <w:p>
             <w:r>
@@ -1008,7 +1300,7 @@
         </w:tc>
         <w:tc>
           <w:tcPr>
-            <w:tcW w:type="dxa" w:w="4320"/>
+            <w:tcW w:type="dxa" w:w="5040"/>
           </w:tcPr>
           <w:p>
             <w:r>
@@ -1020,7 +1312,7 @@
       <w:tr>
         <w:tc>
           <w:tcPr>
-            <w:tcW w:type="dxa" w:w="4320"/>
+            <w:tcW w:type="dxa" w:w="5040"/>
           </w:tcPr>
           <w:p>
             <w:r>
@@ -1030,7 +1322,7 @@
         </w:tc>
         <w:tc>
           <w:tcPr>
-            <w:tcW w:type="dxa" w:w="4320"/>
+            <w:tcW w:type="dxa" w:w="5040"/>
           </w:tcPr>
           <w:p>
             <w:r>
@@ -1042,7 +1334,7 @@
       <w:tr>
         <w:tc>
           <w:tcPr>
-            <w:tcW w:type="dxa" w:w="4320"/>
+            <w:tcW w:type="dxa" w:w="5040"/>
           </w:tcPr>
           <w:p>
             <w:r>
@@ -1052,7 +1344,7 @@
         </w:tc>
         <w:tc>
           <w:tcPr>
-            <w:tcW w:type="dxa" w:w="4320"/>
+            <w:tcW w:type="dxa" w:w="5040"/>
           </w:tcPr>
           <w:p>
             <w:r>
@@ -1064,7 +1356,7 @@
       <w:tr>
         <w:tc>
           <w:tcPr>
-            <w:tcW w:type="dxa" w:w="4320"/>
+            <w:tcW w:type="dxa" w:w="5040"/>
           </w:tcPr>
           <w:p>
             <w:r>
@@ -1074,7 +1366,7 @@
         </w:tc>
         <w:tc>
           <w:tcPr>
-            <w:tcW w:type="dxa" w:w="4320"/>
+            <w:tcW w:type="dxa" w:w="5040"/>
           </w:tcPr>
           <w:p>
             <w:r>
@@ -1096,13 +1388,13 @@
         <w:tblLook w:firstColumn="1" w:firstRow="1" w:lastColumn="0" w:lastRow="0" w:noHBand="0" w:noVBand="1" w:val="04A0"/>
       </w:tblPr>
       <w:tblGrid>
-        <w:gridCol w:w="4320"/>
-        <w:gridCol w:w="4320"/>
+        <w:gridCol w:w="5040"/>
+        <w:gridCol w:w="5040"/>
       </w:tblGrid>
       <w:tr>
         <w:tc>
           <w:tcPr>
-            <w:tcW w:type="dxa" w:w="4320"/>
+            <w:tcW w:type="dxa" w:w="5040"/>
           </w:tcPr>
           <w:p>
             <w:r>
@@ -1112,7 +1404,7 @@
         </w:tc>
         <w:tc>
           <w:tcPr>
-            <w:tcW w:type="dxa" w:w="4320"/>
+            <w:tcW w:type="dxa" w:w="5040"/>
           </w:tcPr>
           <w:p>
             <w:r>
@@ -1124,7 +1416,7 @@
       <w:tr>
         <w:tc>
           <w:tcPr>
-            <w:tcW w:type="dxa" w:w="4320"/>
+            <w:tcW w:type="dxa" w:w="5040"/>
           </w:tcPr>
           <w:p>
             <w:r>
@@ -1134,7 +1426,7 @@
         </w:tc>
         <w:tc>
           <w:tcPr>
-            <w:tcW w:type="dxa" w:w="4320"/>
+            <w:tcW w:type="dxa" w:w="5040"/>
           </w:tcPr>
           <w:p>
             <w:r>
@@ -1146,7 +1438,7 @@
       <w:tr>
         <w:tc>
           <w:tcPr>
-            <w:tcW w:type="dxa" w:w="4320"/>
+            <w:tcW w:type="dxa" w:w="5040"/>
           </w:tcPr>
           <w:p>
             <w:r>
@@ -1156,7 +1448,7 @@
         </w:tc>
         <w:tc>
           <w:tcPr>
-            <w:tcW w:type="dxa" w:w="4320"/>
+            <w:tcW w:type="dxa" w:w="5040"/>
           </w:tcPr>
           <w:p>
             <w:r>
@@ -1168,7 +1460,7 @@
       <w:tr>
         <w:tc>
           <w:tcPr>
-            <w:tcW w:type="dxa" w:w="4320"/>
+            <w:tcW w:type="dxa" w:w="5040"/>
           </w:tcPr>
           <w:p>
             <w:r>
@@ -1178,7 +1470,7 @@
         </w:tc>
         <w:tc>
           <w:tcPr>
-            <w:tcW w:type="dxa" w:w="4320"/>
+            <w:tcW w:type="dxa" w:w="5040"/>
           </w:tcPr>
           <w:p>
             <w:r>
@@ -1198,7 +1490,7 @@
         <w:drawing>
           <wp:inline xmlns:a="http://schemas.openxmlformats.org/drawingml/2006/main" xmlns:pic="http://schemas.openxmlformats.org/drawingml/2006/picture">
             <wp:extent cx="5669280" cy="2267712"/>
-            <wp:docPr id="4" name="Picture 4"/>
+            <wp:docPr id="6" name="Picture 6"/>
             <wp:cNvGraphicFramePr>
               <a:graphicFrameLocks noChangeAspect="1"/>
             </wp:cNvGraphicFramePr>
@@ -1210,7 +1502,7 @@
                     <pic:cNvPicPr/>
                   </pic:nvPicPr>
                   <pic:blipFill>
-                    <a:blip r:embed="rId12"/>
+                    <a:blip r:embed="rId14"/>
                     <a:stretch>
                       <a:fillRect/>
                     </a:stretch>
@@ -1231,12 +1523,25 @@
     </w:p>
     <w:p>
       <w:r>
-        <w:t>Figure 4. Best validation accuracy across the learning rate sweep (left) and the dropout sweep at the best learning rate (right).</w:t>
+        <w:t>Figure 6. Best validation accuracy across the learning rate sweep (left) and the dropout sweep at the best learning rate (right).</w:t>
       </w:r>
     </w:p>
     <w:p>
       <w:r>
-        <w:t>The best tuned configuration reached 74.300% validation accuracy, which did not exceed the original 75.556% achieved with learning rate 0.001 and dropout 0.3. The original regularized model was therefore kept as the final model, and its test results above are unchanged.</w:t>
+        <w:t>The best dropout-sweep run reached 74.300% validation accuracy, which did not exceed the original 75.556% achieved with learning rate 0.001 and dropout 0.3. The learning-rate sweep matched the original score at the same settings; the repeated dropout-sweep run scored lower. The original regularized model was therefore kept as the final model, and its test results above are unchanged.</w:t>
+      </w:r>
+    </w:p>
+    <w:p>
+      <w:pPr>
+        <w:pStyle w:val="Heading2"/>
+      </w:pPr>
+      <w:r>
+        <w:t>Limitations</w:t>
+      </w:r>
+    </w:p>
+    <w:p>
+      <w:r>
+        <w:t>The dataset was evaluated with one stratified split and one initial seed. Three-epoch runs and a two-stage search give a useful comparison but do not measure uncertainty across seeds or establish convergence. Batch normalization and dropout were changed together, so their individual effects cannot be inferred. The initial test result was viewed before the tuning sweep; although tuning selected configurations by validation accuracy, a fresh test set would provide a stronger final unbiased estimate. The test set describes performance on this dataset; robustness to new sources, lighting, viewpoints, and class definitions remains unmeasured. Dog recall of 0.171 is a material limitation despite the overall 0.746 accuracy.</w:t>
       </w:r>
     </w:p>
     <w:p>
@@ -1249,7 +1554,7 @@
     </w:p>
     <w:p>
       <w:r>
-        <w:t>Future work could compare larger input sizes, more training epochs with early stopping, class-weighted loss to offset the uneven class counts, additional augmentation such as rotation and cropping, and pretrained feature extractors (transfer learning) rather than a network trained from scratch. Any of these changes would need a new validation comparison and a fresh held-out test set for a fair final estimate. Averaging several random seeds per hyperparameter configuration would also make the tuning results above more reliable, since single three-epoch runs showed noticeable run-to-run variance.</w:t>
+        <w:t>Future work could compare larger input sizes, more training epochs with early stopping, class-weighted loss to offset the uneven class counts, additional augmentation such as rotation and cropping, and pretrained feature extractors (transfer learning) rather than a network trained from scratch. Any of these changes would need a new validation comparison and a fresh held-out test set for a fair final estimate. Averaging several random seeds per hyperparameter configuration would also make the tuning comparison more reliable; the repeated three-epoch configuration produced different validation scores.</w:t>
       </w:r>
     </w:p>
     <w:p>
@@ -1262,22 +1567,22 @@
     </w:p>
     <w:p>
       <w:r>
-        <w:t>The single biggest driver of accuracy in this project was regularization, not hyperparameter tuning: adding batch normalization and dropout raised best validation accuracy by 20.9% (from 54.686% to 75.556%), a larger gain than any single learning-rate or dropout value found in the grid search.</w:t>
+        <w:t>The largest measured change in this comparison came from the combined architecture modification: adding batch normalization and dropout raised best validation accuracy by 20.9 percentage points (from 54.686% to 75.556%), a larger gain than any improvement retained after the learning-rate and dropout search. This comparison does not separate the effects of batch normalization and dropout.</w:t>
       </w:r>
     </w:p>
     <w:p>
       <w:r>
-        <w:t>The hyperparameter search did not improve on the original settings (best alternative 74.300% versus 75.556% original), so within the ranges tested no further gain was available from learning rate or dropout alone.</w:t>
+        <w:t>The hyperparameter search did not improve on the original settings (best dropout-sweep run 74.300% versus 75.556% original). Within the values and three-epoch runs tested, no further gain was observed from changing learning rate or dropout alone.</w:t>
       </w:r>
     </w:p>
     <w:p>
       <w:r>
-        <w:t>Dog is the model's weakest category (recall 0.171, F1 0.255); the largest confusion errors on the test set were 43 true 'cat' images predicted as 'person'; 40 true 'dog' images predicted as 'person'; 25 true 'dog' images predicted as 'cat'. Recommendation: prioritize more or better-augmented dog training images, or a class-weighted loss, before any further architecture or hyperparameter changes, since that is where most of the remaining error is concentrated.</w:t>
+        <w:t>Dog is the model's weakest category (recall 0.171, F1 0.255); the largest confusion errors on the test set were 43 true 'cat' images predicted as 'person'; 40 true 'dog' images predicted as 'person'; 25 true 'dog' images predicted as 'cat'. Recommendation: prioritize more or better-augmented dog training images, or a class-weighted loss, before any further architecture or hyperparameter changes, since that class has the largest single share of the observed test errors.</w:t>
       </w:r>
     </w:p>
     <w:p>
       <w:r>
-        <w:t>Recommendation for deployment: the regularized model (test accuracy 74.589%, macro F1 0.712) is the checkpoint to use from this project. It is adequate for a coarse eight-class screen but not yet reliable for use cases where confusing dog with a visually similar class is costly; for those, address the observation above and revisit the future-work items before deploying.</w:t>
+        <w:t>Recommendation for deployment: the regularized model (test accuracy 74.589%, macro F1 0.712) is the strongest checkpoint measured in this project. These experiments do not establish deployment readiness. The low dog recall calls for targeted error analysis and evaluation on new images before any practical use.</w:t>
       </w:r>
     </w:p>
     <w:p>
@@ -1290,7 +1595,7 @@
     </w:p>
     <w:p>
       <w:r>
-        <w:t>Dataset: Prasun Roy, Natural Images, Kaggle, https://www.kaggle.com/datasets/prasunroy/natural-images . Source code and measured results are included with this submission. Run python train.py --epochs 3, then python tune.py, then python make_report.py with the required packages installed.</w:t>
+        <w:t>Dataset: Prasun Roy, Natural Images, Kaggle, https://www.kaggle.com/datasets/prasunroy/natural-images. The submission notebook Image_Classification_CNN.ipynb contains data loading, both CNNs, training, evaluation, tuning, and visual analysis. Set DEFAULT_DATA to the directory containing the eight class folders, install requirements.txt, and run the notebook in order with 3 epochs per architecture. The stratified split and model initialization use seed 42; augmentation and CPU execution can still yield small differences across reruns. Metrics and figures used in this report are preserved in results/.</w:t>
       </w:r>
     </w:p>
     <w:p>
@@ -1308,7 +1613,7 @@
     </w:p>
     <w:sectPr>
       <w:pgSz w:w="12240" w:h="15840"/>
-      <w:pgMar w:top="1440" w:right="1800" w:bottom="1440" w:left="1800" w:header="720" w:footer="720" w:gutter="0"/>
+      <w:pgMar w:top="1440" w:right="1080" w:bottom="1440" w:left="1080" w:header="720" w:footer="720" w:gutter="0"/>
       <w:cols w:space="720"/>
       <w:docGrid w:linePitch="360"/>
     </w:sectPr>
@@ -1679,6 +1984,9 @@
     <w:name w:val="Normal"/>
     <w:qFormat/>
     <w:rsid w:val="00FC693F"/>
+    <w:rPr>
+      <w:sz w:val="21"/>
+    </w:rPr>
   </w:style>
   <w:style w:type="paragraph" w:styleId="Header">
     <w:name w:val="header"/>

</xml_diff>